<commit_message>
update WIS2 Manual build
</commit_message>
<xml_diff>
--- a/manual/wis2-manual-APPROVED.docx
+++ b/manual/wis2-manual-APPROVED.docx
@@ -99,7 +99,7 @@
         <w:pStyle w:val="Date"/>
       </w:pPr>
       <w:r>
-        <w:t xml:space="preserve">2026-06-18</w:t>
+        <w:t xml:space="preserve">2026-07-06</w:t>
       </w:r>
     </w:p>
     <w:p>
@@ -152,7 +152,7 @@
               <w:jc w:val="left"/>
             </w:pPr>
             <w:r>
-              <w:t xml:space="preserve">Date: 2026-06-18</w:t>
+              <w:t xml:space="preserve">Date: 2026-07-06</w:t>
             </w:r>
           </w:p>
         </w:tc>
@@ -196,12 +196,12 @@
             <w:r>
               <w:t xml:space="preserve"> </w:t>
             </w:r>
-            <w:hyperlink w:anchor="Xc3fb3732b01efd4a12c762bb4e6923e7c4e3bd2">
+            <w:hyperlink w:anchor="X7154dcec22897e76041074c755bb1c794753b8a">
               <w:r>
                 <w:rPr>
                   <w:rStyle w:val="Hyperlink"/>
                 </w:rPr>
-                <w:t xml:space="preserve">APPENDIX G</w:t>
+                <w:t xml:space="preserve">APPENDIX H</w:t>
               </w:r>
             </w:hyperlink>
           </w:p>
@@ -8964,6 +8964,216 @@
       </w:hyperlink>
     </w:p>
     <w:bookmarkEnd w:id="96"/>
+    <w:bookmarkStart w:id="97" w:name="X7154dcec22897e76041074c755bb1c794753b8a"/>
+    <w:p>
+      <w:pPr>
+        <w:pStyle w:val="Heading1"/>
+      </w:pPr>
+      <w:r>
+        <w:t xml:space="preserve">APPENDIX H: REVISION HISTORY</w:t>
+      </w:r>
+    </w:p>
+    <w:tbl>
+      <w:tblPr>
+        <w:tblStyle w:val="Table"/>
+        <w:tblW w:type="pct" w:w="5000"/>
+        <w:tblLook w:firstRow="1" w:lastRow="0" w:firstColumn="0" w:lastColumn="0" w:noHBand="0" w:noVBand="0" w:val="0020"/>
+        <w:jc w:val="start"/>
+      </w:tblPr>
+      <w:tblGrid>
+        <w:gridCol w:w="950"/>
+        <w:gridCol w:w="1425"/>
+        <w:gridCol w:w="950"/>
+        <w:gridCol w:w="950"/>
+        <w:gridCol w:w="3643"/>
+      </w:tblGrid>
+      <w:tr>
+        <w:trPr>
+          <w:tblHeader w:val="true"/>
+        </w:trPr>
+        <w:tc>
+          <w:tcPr/>
+          <w:p>
+            <w:pPr>
+              <w:pStyle w:val="Compact"/>
+              <w:jc w:val="left"/>
+            </w:pPr>
+            <w:r>
+              <w:t xml:space="preserve">Date</w:t>
+            </w:r>
+          </w:p>
+        </w:tc>
+        <w:tc>
+          <w:tcPr/>
+          <w:p>
+            <w:pPr>
+              <w:pStyle w:val="Compact"/>
+              <w:jc w:val="left"/>
+            </w:pPr>
+            <w:r>
+              <w:t xml:space="preserve">Release</w:t>
+            </w:r>
+          </w:p>
+        </w:tc>
+        <w:tc>
+          <w:tcPr/>
+          <w:p>
+            <w:pPr>
+              <w:pStyle w:val="Compact"/>
+              <w:jc w:val="left"/>
+            </w:pPr>
+            <w:r>
+              <w:t xml:space="preserve">Proposed by</w:t>
+            </w:r>
+          </w:p>
+        </w:tc>
+        <w:tc>
+          <w:tcPr/>
+          <w:p>
+            <w:pPr>
+              <w:pStyle w:val="Compact"/>
+              <w:jc w:val="left"/>
+            </w:pPr>
+            <w:r>
+              <w:t xml:space="preserve">Primary clauses modified</w:t>
+            </w:r>
+          </w:p>
+        </w:tc>
+        <w:tc>
+          <w:tcPr/>
+          <w:p>
+            <w:pPr>
+              <w:pStyle w:val="Compact"/>
+              <w:jc w:val="left"/>
+            </w:pPr>
+            <w:r>
+              <w:t xml:space="preserve">Approved by</w:t>
+            </w:r>
+          </w:p>
+        </w:tc>
+      </w:tr>
+      <w:tr>
+        <w:tc>
+          <w:tcPr/>
+          <w:p>
+            <w:pPr>
+              <w:jc w:val="left"/>
+            </w:pPr>
+            <w:r>
+              <w:t xml:space="preserve">May 2023</w:t>
+            </w:r>
+          </w:p>
+        </w:tc>
+        <w:tc>
+          <w:tcPr/>
+          <w:p>
+            <w:pPr>
+              <w:jc w:val="left"/>
+            </w:pPr>
+            <w:r>
+              <w:t xml:space="preserve">1.0.0</w:t>
+            </w:r>
+          </w:p>
+        </w:tc>
+        <w:tc>
+          <w:tcPr/>
+          <w:p>
+            <w:pPr>
+              <w:jc w:val="left"/>
+            </w:pPr>
+            <w:r>
+              <w:t xml:space="preserve">INFCOM</w:t>
+            </w:r>
+          </w:p>
+        </w:tc>
+        <w:tc>
+          <w:tcPr/>
+          <w:p>
+            <w:pPr>
+              <w:jc w:val="left"/>
+            </w:pPr>
+            <w:r>
+              <w:t xml:space="preserve">Initial approval for publication (2023 edition)</w:t>
+            </w:r>
+          </w:p>
+        </w:tc>
+        <w:tc>
+          <w:tcPr/>
+          <w:p>
+            <w:pPr>
+              <w:jc w:val="left"/>
+            </w:pPr>
+            <w:r>
+              <w:t xml:space="preserve">Cg-19</w:t>
+            </w:r>
+          </w:p>
+        </w:tc>
+      </w:tr>
+      <w:tr>
+        <w:tc>
+          <w:tcPr/>
+          <w:p>
+            <w:pPr>
+              <w:jc w:val="left"/>
+            </w:pPr>
+            <w:r>
+              <w:t xml:space="preserve">June 2024</w:t>
+            </w:r>
+          </w:p>
+        </w:tc>
+        <w:tc>
+          <w:tcPr/>
+          <w:p>
+            <w:pPr>
+              <w:jc w:val="left"/>
+            </w:pPr>
+            <w:r>
+              <w:t xml:space="preserve">1.1.0</w:t>
+            </w:r>
+          </w:p>
+        </w:tc>
+        <w:tc>
+          <w:tcPr/>
+          <w:p>
+            <w:pPr>
+              <w:jc w:val="left"/>
+            </w:pPr>
+            <w:r>
+              <w:t xml:space="preserve">INFCOM</w:t>
+            </w:r>
+          </w:p>
+        </w:tc>
+        <w:tc>
+          <w:tcPr/>
+          <w:p>
+            <w:pPr>
+              <w:jc w:val="left"/>
+            </w:pPr>
+            <w:r>
+              <w:t xml:space="preserve">Sections 2.5, 3.7, 4.5, 4.6, 4.7 and Part VI: To update procedures, guidance or requirements for WIS Centres, Global Caches,</w:t>
+            </w:r>
+            <w:r>
+              <w:t xml:space="preserve"> </w:t>
+            </w:r>
+            <w:r>
+              <w:t xml:space="preserve">Global Discovery Catalogues, managing operations of WIS, and information management. Addition of Appendices D, E and F on WIS2 Topic Hierarchy, WIS2 Notification Message, and WCMP2.</w:t>
+            </w:r>
+          </w:p>
+        </w:tc>
+        <w:tc>
+          <w:tcPr/>
+          <w:p>
+            <w:pPr>
+              <w:jc w:val="left"/>
+            </w:pPr>
+            <w:r>
+              <w:t xml:space="preserve">EC-78</w:t>
+            </w:r>
+          </w:p>
+        </w:tc>
+      </w:tr>
+    </w:tbl>
+    <w:bookmarkEnd w:id="97"/>
     <w:sectPr/>
   </w:body>
 </w:document>

</xml_diff>